<commit_message>
Fix mentor client assignments and full names in People Lead docs.
Andressa Silva is at MAPFRE; Ana Karina is at BANCO BRADESCO. Remove the mixed-client ambiguity and regenerate Word dossiers.

Co-authored-by: Jonatas Andrade <jonatasandradedeveloper@users.noreply.github.com>
</commit_message>
<xml_diff>
--- a/people-lead/word/00-README-kit.docx
+++ b/people-lead/word/00-README-kit.docx
@@ -34,7 +34,7 @@
         <w:rPr>
           <w:b/>
         </w:rPr>
-        <w:t>Andressa</w:t>
+        <w:t>Andressa Silva (MAPFRE)</w:t>
       </w:r>
       <w:r>
         <w:t xml:space="preserve"> e </w:t>
@@ -43,7 +43,7 @@
         <w:rPr>
           <w:b/>
         </w:rPr>
-        <w:t>Ana</w:t>
+        <w:t>Ana Karina (BANCO BRADESCO)</w:t>
       </w:r>
       <w:r>
         <w:t>.</w:t>
@@ -121,6 +121,577 @@
         <w:pStyle w:val="Heading2"/>
       </w:pPr>
       <w:r>
+        <w:t>Versão Word (editável no Microsoft Word / Google Docs)</w:t>
+      </w:r>
+    </w:p>
+    <w:p>
+      <w:pPr>
+        <w:pStyle w:val="Heading3"/>
+      </w:pPr>
+      <w:r>
+        <w:t>Documentos completos (use estes)</w:t>
+      </w:r>
+    </w:p>
+    <w:tbl>
+      <w:tblPr>
+        <w:tblStyle w:val="TableGrid"/>
+        <w:tblW w:type="auto" w:w="0"/>
+        <w:tblLook w:firstColumn="1" w:firstRow="1" w:lastColumn="0" w:lastRow="0" w:noHBand="0" w:noVBand="1" w:val="04A0"/>
+      </w:tblPr>
+      <w:tblGrid>
+        <w:gridCol w:w="4873"/>
+        <w:gridCol w:w="4873"/>
+      </w:tblGrid>
+      <w:tr>
+        <w:tc>
+          <w:tcPr>
+            <w:tcW w:type="dxa" w:w="4873"/>
+            <w:shd w:fill="1F3A5F" w:val="clear"/>
+          </w:tcPr>
+          <w:p>
+            <w:r>
+              <w:rPr>
+                <w:b/>
+                <w:color w:val="FFFFFF"/>
+                <w:sz w:val="20"/>
+              </w:rPr>
+            </w:r>
+            <w:r>
+              <w:rPr>
+                <w:b/>
+                <w:color w:val="FFFFFF"/>
+                <w:sz w:val="20"/>
+              </w:rPr>
+              <w:t>Arquivo</w:t>
+            </w:r>
+          </w:p>
+        </w:tc>
+        <w:tc>
+          <w:tcPr>
+            <w:tcW w:type="dxa" w:w="4873"/>
+            <w:shd w:fill="1F3A5F" w:val="clear"/>
+          </w:tcPr>
+          <w:p>
+            <w:r>
+              <w:rPr>
+                <w:b/>
+                <w:color w:val="FFFFFF"/>
+                <w:sz w:val="20"/>
+              </w:rPr>
+            </w:r>
+            <w:r>
+              <w:rPr>
+                <w:b/>
+                <w:color w:val="FFFFFF"/>
+                <w:sz w:val="20"/>
+              </w:rPr>
+              <w:t>Conteúdo</w:t>
+            </w:r>
+          </w:p>
+        </w:tc>
+      </w:tr>
+      <w:tr>
+        <w:tc>
+          <w:tcPr>
+            <w:tcW w:type="dxa" w:w="4873"/>
+          </w:tcPr>
+          <w:p>
+            <w:r>
+              <w:rPr>
+                <w:sz w:val="20"/>
+              </w:rPr>
+            </w:r>
+            <w:r>
+              <w:rPr>
+                <w:sz w:val="20"/>
+              </w:rPr>
+              <w:t>[</w:t>
+            </w:r>
+            <w:r>
+              <w:rPr>
+                <w:rFonts w:ascii="Consolas" w:hAnsi="Consolas"/>
+                <w:color w:val="333333"/>
+                <w:sz w:val="20"/>
+              </w:rPr>
+              <w:t>word/Andressa-Silva-Historico-Completo-People-Lead.docx</w:t>
+            </w:r>
+            <w:r>
+              <w:rPr>
+                <w:sz w:val="20"/>
+              </w:rPr>
+              <w:t>](word/Andressa-Silva-Historico-Completo-People-Lead.docx)</w:t>
+            </w:r>
+          </w:p>
+        </w:tc>
+        <w:tc>
+          <w:tcPr>
+            <w:tcW w:type="dxa" w:w="4873"/>
+          </w:tcPr>
+          <w:p>
+            <w:r>
+              <w:rPr>
+                <w:sz w:val="20"/>
+              </w:rPr>
+            </w:r>
+            <w:r>
+              <w:rPr>
+                <w:sz w:val="20"/>
+              </w:rPr>
+              <w:t xml:space="preserve">Capa, sumário, ficha, 1:1s, prioridades, carreira, ciclo, ações, anexos — cliente </w:t>
+            </w:r>
+            <w:r>
+              <w:rPr>
+                <w:b/>
+                <w:sz w:val="20"/>
+              </w:rPr>
+              <w:t>MAPFRE</w:t>
+            </w:r>
+          </w:p>
+        </w:tc>
+      </w:tr>
+      <w:tr>
+        <w:tc>
+          <w:tcPr>
+            <w:tcW w:type="dxa" w:w="4873"/>
+            <w:shd w:fill="F3F6FA" w:val="clear"/>
+          </w:tcPr>
+          <w:p>
+            <w:r>
+              <w:rPr>
+                <w:sz w:val="20"/>
+              </w:rPr>
+            </w:r>
+            <w:r>
+              <w:rPr>
+                <w:sz w:val="20"/>
+              </w:rPr>
+              <w:t>[</w:t>
+            </w:r>
+            <w:r>
+              <w:rPr>
+                <w:rFonts w:ascii="Consolas" w:hAnsi="Consolas"/>
+                <w:color w:val="333333"/>
+                <w:sz w:val="20"/>
+              </w:rPr>
+              <w:t>word/Ana-Karina-Historico-Completo-People-Lead.docx</w:t>
+            </w:r>
+            <w:r>
+              <w:rPr>
+                <w:sz w:val="20"/>
+              </w:rPr>
+              <w:t>](word/Ana-Karina-Historico-Completo-People-Lead.docx)</w:t>
+            </w:r>
+          </w:p>
+        </w:tc>
+        <w:tc>
+          <w:tcPr>
+            <w:tcW w:type="dxa" w:w="4873"/>
+            <w:shd w:fill="F3F6FA" w:val="clear"/>
+          </w:tcPr>
+          <w:p>
+            <w:r>
+              <w:rPr>
+                <w:sz w:val="20"/>
+              </w:rPr>
+            </w:r>
+            <w:r>
+              <w:rPr>
+                <w:sz w:val="20"/>
+              </w:rPr>
+              <w:t xml:space="preserve">Idem para Ana Karina — cliente </w:t>
+            </w:r>
+            <w:r>
+              <w:rPr>
+                <w:b/>
+                <w:sz w:val="20"/>
+              </w:rPr>
+              <w:t>BANCO BRADESCO</w:t>
+            </w:r>
+          </w:p>
+        </w:tc>
+      </w:tr>
+    </w:tbl>
+    <w:p/>
+    <w:p>
+      <w:r>
+        <w:t>Regenerar os completos:</w:t>
+      </w:r>
+    </w:p>
+    <w:p>
+      <w:pPr>
+        <w:ind w:left="283"/>
+      </w:pPr>
+      <w:r>
+        <w:rPr>
+          <w:rFonts w:ascii="Consolas" w:hAnsi="Consolas"/>
+          <w:sz w:val="18"/>
+        </w:rPr>
+        <w:t>cd people-lead &amp;&amp; python3 generate_complete_docs.py</w:t>
+      </w:r>
+    </w:p>
+    <w:p>
+      <w:pPr>
+        <w:pStyle w:val="Heading3"/>
+      </w:pPr>
+      <w:r>
+        <w:t>Demais arquivos Word</w:t>
+      </w:r>
+    </w:p>
+    <w:tbl>
+      <w:tblPr>
+        <w:tblStyle w:val="TableGrid"/>
+        <w:tblW w:type="auto" w:w="0"/>
+        <w:tblLook w:firstColumn="1" w:firstRow="1" w:lastColumn="0" w:lastRow="0" w:noHBand="0" w:noVBand="1" w:val="04A0"/>
+      </w:tblPr>
+      <w:tblGrid>
+        <w:gridCol w:w="4873"/>
+        <w:gridCol w:w="4873"/>
+      </w:tblGrid>
+      <w:tr>
+        <w:tc>
+          <w:tcPr>
+            <w:tcW w:type="dxa" w:w="4873"/>
+            <w:shd w:fill="1F3A5F" w:val="clear"/>
+          </w:tcPr>
+          <w:p>
+            <w:r>
+              <w:rPr>
+                <w:b/>
+                <w:color w:val="FFFFFF"/>
+                <w:sz w:val="20"/>
+              </w:rPr>
+            </w:r>
+            <w:r>
+              <w:rPr>
+                <w:b/>
+                <w:color w:val="FFFFFF"/>
+                <w:sz w:val="20"/>
+              </w:rPr>
+              <w:t>Arquivo</w:t>
+            </w:r>
+          </w:p>
+        </w:tc>
+        <w:tc>
+          <w:tcPr>
+            <w:tcW w:type="dxa" w:w="4873"/>
+            <w:shd w:fill="1F3A5F" w:val="clear"/>
+          </w:tcPr>
+          <w:p>
+            <w:r>
+              <w:rPr>
+                <w:b/>
+                <w:color w:val="FFFFFF"/>
+                <w:sz w:val="20"/>
+              </w:rPr>
+            </w:r>
+            <w:r>
+              <w:rPr>
+                <w:b/>
+                <w:color w:val="FFFFFF"/>
+                <w:sz w:val="20"/>
+              </w:rPr>
+              <w:t>Uso</w:t>
+            </w:r>
+          </w:p>
+        </w:tc>
+      </w:tr>
+      <w:tr>
+        <w:tc>
+          <w:tcPr>
+            <w:tcW w:type="dxa" w:w="4873"/>
+          </w:tcPr>
+          <w:p>
+            <w:r>
+              <w:rPr>
+                <w:sz w:val="20"/>
+              </w:rPr>
+            </w:r>
+            <w:r>
+              <w:rPr>
+                <w:rFonts w:ascii="Consolas" w:hAnsi="Consolas"/>
+                <w:color w:val="333333"/>
+                <w:sz w:val="20"/>
+              </w:rPr>
+              <w:t>word/00-dashboard.docx</w:t>
+            </w:r>
+          </w:p>
+        </w:tc>
+        <w:tc>
+          <w:tcPr>
+            <w:tcW w:type="dxa" w:w="4873"/>
+          </w:tcPr>
+          <w:p>
+            <w:r>
+              <w:rPr>
+                <w:sz w:val="20"/>
+              </w:rPr>
+            </w:r>
+            <w:r>
+              <w:rPr>
+                <w:sz w:val="20"/>
+              </w:rPr>
+              <w:t>Visão das duas</w:t>
+            </w:r>
+          </w:p>
+        </w:tc>
+      </w:tr>
+      <w:tr>
+        <w:tc>
+          <w:tcPr>
+            <w:tcW w:type="dxa" w:w="4873"/>
+            <w:shd w:fill="F3F6FA" w:val="clear"/>
+          </w:tcPr>
+          <w:p>
+            <w:r>
+              <w:rPr>
+                <w:sz w:val="20"/>
+              </w:rPr>
+            </w:r>
+            <w:r>
+              <w:rPr>
+                <w:rFonts w:ascii="Consolas" w:hAnsi="Consolas"/>
+                <w:color w:val="333333"/>
+                <w:sz w:val="20"/>
+              </w:rPr>
+              <w:t>word/01-ciclo-dezembro-orientacao.docx</w:t>
+            </w:r>
+          </w:p>
+        </w:tc>
+        <w:tc>
+          <w:tcPr>
+            <w:tcW w:type="dxa" w:w="4873"/>
+            <w:shd w:fill="F3F6FA" w:val="clear"/>
+          </w:tcPr>
+          <w:p>
+            <w:r>
+              <w:rPr>
+                <w:sz w:val="20"/>
+              </w:rPr>
+            </w:r>
+            <w:r>
+              <w:rPr>
+                <w:sz w:val="20"/>
+              </w:rPr>
+              <w:t>Orientação do December Cycle</w:t>
+            </w:r>
+          </w:p>
+        </w:tc>
+      </w:tr>
+      <w:tr>
+        <w:tc>
+          <w:tcPr>
+            <w:tcW w:type="dxa" w:w="4873"/>
+          </w:tcPr>
+          <w:p>
+            <w:r>
+              <w:rPr>
+                <w:sz w:val="20"/>
+              </w:rPr>
+            </w:r>
+            <w:r>
+              <w:rPr>
+                <w:rFonts w:ascii="Consolas" w:hAnsi="Consolas"/>
+                <w:color w:val="333333"/>
+                <w:sz w:val="20"/>
+              </w:rPr>
+              <w:t>word/02-parecer-prioridades.docx</w:t>
+            </w:r>
+          </w:p>
+        </w:tc>
+        <w:tc>
+          <w:tcPr>
+            <w:tcW w:type="dxa" w:w="4873"/>
+          </w:tcPr>
+          <w:p>
+            <w:r>
+              <w:rPr>
+                <w:sz w:val="20"/>
+              </w:rPr>
+            </w:r>
+            <w:r>
+              <w:rPr>
+                <w:sz w:val="20"/>
+              </w:rPr>
+              <w:t>Parecer das prioridades</w:t>
+            </w:r>
+          </w:p>
+        </w:tc>
+      </w:tr>
+      <w:tr>
+        <w:tc>
+          <w:tcPr>
+            <w:tcW w:type="dxa" w:w="4873"/>
+            <w:shd w:fill="F3F6FA" w:val="clear"/>
+          </w:tcPr>
+          <w:p>
+            <w:r>
+              <w:rPr>
+                <w:sz w:val="20"/>
+              </w:rPr>
+            </w:r>
+            <w:r>
+              <w:rPr>
+                <w:rFonts w:ascii="Consolas" w:hAnsi="Consolas"/>
+                <w:color w:val="333333"/>
+                <w:sz w:val="20"/>
+              </w:rPr>
+              <w:t>word/andressa/*.docx</w:t>
+            </w:r>
+            <w:r>
+              <w:rPr>
+                <w:sz w:val="20"/>
+              </w:rPr>
+              <w:t xml:space="preserve"> / </w:t>
+            </w:r>
+            <w:r>
+              <w:rPr>
+                <w:rFonts w:ascii="Consolas" w:hAnsi="Consolas"/>
+                <w:color w:val="333333"/>
+                <w:sz w:val="20"/>
+              </w:rPr>
+              <w:t>word/ana/*.docx</w:t>
+            </w:r>
+          </w:p>
+        </w:tc>
+        <w:tc>
+          <w:tcPr>
+            <w:tcW w:type="dxa" w:w="4873"/>
+            <w:shd w:fill="F3F6FA" w:val="clear"/>
+          </w:tcPr>
+          <w:p>
+            <w:r>
+              <w:rPr>
+                <w:sz w:val="20"/>
+              </w:rPr>
+            </w:r>
+            <w:r>
+              <w:rPr>
+                <w:sz w:val="20"/>
+              </w:rPr>
+              <w:t>Capítulos soltos</w:t>
+            </w:r>
+          </w:p>
+        </w:tc>
+      </w:tr>
+      <w:tr>
+        <w:tc>
+          <w:tcPr>
+            <w:tcW w:type="dxa" w:w="4873"/>
+          </w:tcPr>
+          <w:p>
+            <w:r>
+              <w:rPr>
+                <w:sz w:val="20"/>
+              </w:rPr>
+            </w:r>
+            <w:r>
+              <w:rPr>
+                <w:rFonts w:ascii="Consolas" w:hAnsi="Consolas"/>
+                <w:color w:val="333333"/>
+                <w:sz w:val="20"/>
+              </w:rPr>
+              <w:t>word/_templates/*.docx</w:t>
+            </w:r>
+          </w:p>
+        </w:tc>
+        <w:tc>
+          <w:tcPr>
+            <w:tcW w:type="dxa" w:w="4873"/>
+          </w:tcPr>
+          <w:p>
+            <w:r>
+              <w:rPr>
+                <w:sz w:val="20"/>
+              </w:rPr>
+            </w:r>
+            <w:r>
+              <w:rPr>
+                <w:sz w:val="20"/>
+              </w:rPr>
+              <w:t>Templates de 1:1, feedback e fechamento</w:t>
+            </w:r>
+          </w:p>
+        </w:tc>
+      </w:tr>
+      <w:tr>
+        <w:tc>
+          <w:tcPr>
+            <w:tcW w:type="dxa" w:w="4873"/>
+            <w:shd w:fill="F3F6FA" w:val="clear"/>
+          </w:tcPr>
+          <w:p>
+            <w:r>
+              <w:rPr>
+                <w:sz w:val="20"/>
+              </w:rPr>
+            </w:r>
+            <w:r>
+              <w:rPr>
+                <w:rFonts w:ascii="Consolas" w:hAnsi="Consolas"/>
+                <w:color w:val="333333"/>
+                <w:sz w:val="20"/>
+              </w:rPr>
+              <w:t>word/DOSSIE-*.docx</w:t>
+            </w:r>
+          </w:p>
+        </w:tc>
+        <w:tc>
+          <w:tcPr>
+            <w:tcW w:type="dxa" w:w="4873"/>
+            <w:shd w:fill="F3F6FA" w:val="clear"/>
+          </w:tcPr>
+          <w:p>
+            <w:r>
+              <w:rPr>
+                <w:sz w:val="20"/>
+              </w:rPr>
+            </w:r>
+            <w:r>
+              <w:rPr>
+                <w:sz w:val="20"/>
+              </w:rPr>
+              <w:t xml:space="preserve">Versão concatenada simples (preferir os </w:t>
+            </w:r>
+            <w:r>
+              <w:rPr>
+                <w:i/>
+                <w:sz w:val="20"/>
+              </w:rPr>
+              <w:t>Historico-Completo</w:t>
+            </w:r>
+            <w:r>
+              <w:rPr>
+                <w:sz w:val="20"/>
+              </w:rPr>
+              <w:t>)</w:t>
+            </w:r>
+          </w:p>
+        </w:tc>
+      </w:tr>
+    </w:tbl>
+    <w:p/>
+    <w:p>
+      <w:r>
+        <w:t>Para regenerar os Word a partir dos Markdown (capítulos + dossiês simples):</w:t>
+      </w:r>
+    </w:p>
+    <w:p>
+      <w:pPr>
+        <w:ind w:left="283"/>
+      </w:pPr>
+      <w:r>
+        <w:rPr>
+          <w:rFonts w:ascii="Consolas" w:hAnsi="Consolas"/>
+          <w:sz w:val="18"/>
+        </w:rPr>
+        <w:t>cd people-lead &amp;&amp; python3 generate_word.py</w:t>
+      </w:r>
+    </w:p>
+    <w:p>
+      <w:pPr>
+        <w:pStyle w:val="Heading2"/>
+      </w:pPr>
+      <w:r>
         <w:t>Estrutura</w:t>
       </w:r>
     </w:p>
@@ -142,6 +713,10 @@
         <w:t xml:space="preserve">  01-ciclo-dezembro-orientacao.md          ← CALL geral → papel de cada um</w:t>
         <w:br/>
         <w:t xml:space="preserve">  02-parecer-prioridades.md                ← análise: as prioridades fazem sentido?</w:t>
+        <w:br/>
+        <w:t xml:space="preserve">  generate_word.py                         ← gera os .docx</w:t>
+        <w:br/>
+        <w:t xml:space="preserve">  word/                                    ← arquivos Word editáveis</w:t>
         <w:br/>
         <w:t xml:space="preserve">  _templates/                              ← copiar para novas 1:1s ou novas mentoradas</w:t>
         <w:br/>

</xml_diff>

<commit_message>
Add separate career planning docs aligned to company needs.
One planning Word/Markdown per mentee covering company requirements, career goals, gap matrix, and horizon actions.

Co-authored-by: Jonatas Andrade <jonatasandradedeveloper@users.noreply.github.com>
</commit_message>
<xml_diff>
--- a/people-lead/word/00-README-kit.docx
+++ b/people-lead/word/00-README-kit.docx
@@ -312,6 +312,245 @@
       </w:tr>
     </w:tbl>
     <w:p/>
+    <w:p>
+      <w:pPr>
+        <w:pStyle w:val="Heading3"/>
+      </w:pPr>
+      <w:r>
+        <w:t>Planejamento separado (carreira × empresa)</w:t>
+      </w:r>
+    </w:p>
+    <w:tbl>
+      <w:tblPr>
+        <w:tblStyle w:val="TableGrid"/>
+        <w:tblW w:type="auto" w:w="0"/>
+        <w:tblLook w:firstColumn="1" w:firstRow="1" w:lastColumn="0" w:lastRow="0" w:noHBand="0" w:noVBand="1" w:val="04A0"/>
+      </w:tblPr>
+      <w:tblGrid>
+        <w:gridCol w:w="4873"/>
+        <w:gridCol w:w="4873"/>
+      </w:tblGrid>
+      <w:tr>
+        <w:tc>
+          <w:tcPr>
+            <w:tcW w:type="dxa" w:w="4873"/>
+            <w:shd w:fill="1F3A5F" w:val="clear"/>
+          </w:tcPr>
+          <w:p>
+            <w:r>
+              <w:rPr>
+                <w:b/>
+                <w:color w:val="FFFFFF"/>
+                <w:sz w:val="20"/>
+              </w:rPr>
+            </w:r>
+            <w:r>
+              <w:rPr>
+                <w:b/>
+                <w:color w:val="FFFFFF"/>
+                <w:sz w:val="20"/>
+              </w:rPr>
+              <w:t>Arquivo</w:t>
+            </w:r>
+          </w:p>
+        </w:tc>
+        <w:tc>
+          <w:tcPr>
+            <w:tcW w:type="dxa" w:w="4873"/>
+            <w:shd w:fill="1F3A5F" w:val="clear"/>
+          </w:tcPr>
+          <w:p>
+            <w:r>
+              <w:rPr>
+                <w:b/>
+                <w:color w:val="FFFFFF"/>
+                <w:sz w:val="20"/>
+              </w:rPr>
+            </w:r>
+            <w:r>
+              <w:rPr>
+                <w:b/>
+                <w:color w:val="FFFFFF"/>
+                <w:sz w:val="20"/>
+              </w:rPr>
+              <w:t>Conteúdo</w:t>
+            </w:r>
+          </w:p>
+        </w:tc>
+      </w:tr>
+      <w:tr>
+        <w:tc>
+          <w:tcPr>
+            <w:tcW w:type="dxa" w:w="4873"/>
+          </w:tcPr>
+          <w:p>
+            <w:r>
+              <w:rPr>
+                <w:sz w:val="20"/>
+              </w:rPr>
+            </w:r>
+            <w:r>
+              <w:rPr>
+                <w:sz w:val="20"/>
+              </w:rPr>
+              <w:t>[</w:t>
+            </w:r>
+            <w:r>
+              <w:rPr>
+                <w:rFonts w:ascii="Consolas" w:hAnsi="Consolas"/>
+                <w:color w:val="333333"/>
+                <w:sz w:val="20"/>
+              </w:rPr>
+              <w:t>word/Andressa-Silva-Planejamento-Carreira-e-Empresa.docx</w:t>
+            </w:r>
+            <w:r>
+              <w:rPr>
+                <w:sz w:val="20"/>
+              </w:rPr>
+              <w:t>](word/Andressa-Silva-Planejamento-Carreira-e-Empresa.docx)</w:t>
+            </w:r>
+          </w:p>
+        </w:tc>
+        <w:tc>
+          <w:tcPr>
+            <w:tcW w:type="dxa" w:w="4873"/>
+          </w:tcPr>
+          <w:p>
+            <w:r>
+              <w:rPr>
+                <w:sz w:val="20"/>
+              </w:rPr>
+            </w:r>
+            <w:r>
+              <w:rPr>
+                <w:sz w:val="20"/>
+              </w:rPr>
+              <w:t>O que a empresa precisa × plano de carreira da Andressa (</w:t>
+            </w:r>
+            <w:r>
+              <w:rPr>
+                <w:b/>
+                <w:sz w:val="20"/>
+              </w:rPr>
+              <w:t>MAPFRE</w:t>
+            </w:r>
+            <w:r>
+              <w:rPr>
+                <w:sz w:val="20"/>
+              </w:rPr>
+              <w:t>)</w:t>
+            </w:r>
+          </w:p>
+        </w:tc>
+      </w:tr>
+      <w:tr>
+        <w:tc>
+          <w:tcPr>
+            <w:tcW w:type="dxa" w:w="4873"/>
+            <w:shd w:fill="F3F6FA" w:val="clear"/>
+          </w:tcPr>
+          <w:p>
+            <w:r>
+              <w:rPr>
+                <w:sz w:val="20"/>
+              </w:rPr>
+            </w:r>
+            <w:r>
+              <w:rPr>
+                <w:sz w:val="20"/>
+              </w:rPr>
+              <w:t>[</w:t>
+            </w:r>
+            <w:r>
+              <w:rPr>
+                <w:rFonts w:ascii="Consolas" w:hAnsi="Consolas"/>
+                <w:color w:val="333333"/>
+                <w:sz w:val="20"/>
+              </w:rPr>
+              <w:t>word/Ana-Karina-Planejamento-Carreira-e-Empresa.docx</w:t>
+            </w:r>
+            <w:r>
+              <w:rPr>
+                <w:sz w:val="20"/>
+              </w:rPr>
+              <w:t>](word/Ana-Karina-Planejamento-Carreira-e-Empresa.docx)</w:t>
+            </w:r>
+          </w:p>
+        </w:tc>
+        <w:tc>
+          <w:tcPr>
+            <w:tcW w:type="dxa" w:w="4873"/>
+            <w:shd w:fill="F3F6FA" w:val="clear"/>
+          </w:tcPr>
+          <w:p>
+            <w:r>
+              <w:rPr>
+                <w:sz w:val="20"/>
+              </w:rPr>
+            </w:r>
+            <w:r>
+              <w:rPr>
+                <w:sz w:val="20"/>
+              </w:rPr>
+              <w:t>O que a empresa precisa × plano de carreira da Ana (</w:t>
+            </w:r>
+            <w:r>
+              <w:rPr>
+                <w:b/>
+                <w:sz w:val="20"/>
+              </w:rPr>
+              <w:t>BANCO BRADESCO</w:t>
+            </w:r>
+            <w:r>
+              <w:rPr>
+                <w:sz w:val="20"/>
+              </w:rPr>
+              <w:t>)</w:t>
+            </w:r>
+          </w:p>
+        </w:tc>
+      </w:tr>
+    </w:tbl>
+    <w:p/>
+    <w:p>
+      <w:r>
+        <w:t xml:space="preserve">Fontes: </w:t>
+      </w:r>
+      <w:r>
+        <w:rPr>
+          <w:rFonts w:ascii="Consolas" w:hAnsi="Consolas"/>
+          <w:color w:val="333333"/>
+          <w:sz w:val="18"/>
+        </w:rPr>
+        <w:t>andressa/06-planejamento-carreira-empresa.md</w:t>
+      </w:r>
+      <w:r>
+        <w:t xml:space="preserve"> e </w:t>
+      </w:r>
+      <w:r>
+        <w:rPr>
+          <w:rFonts w:ascii="Consolas" w:hAnsi="Consolas"/>
+          <w:color w:val="333333"/>
+          <w:sz w:val="18"/>
+        </w:rPr>
+        <w:t>ana/06-planejamento-carreira-empresa.md</w:t>
+      </w:r>
+      <w:r>
+        <w:t>.</w:t>
+      </w:r>
+    </w:p>
+    <w:p>
+      <w:pPr>
+        <w:ind w:left="283"/>
+      </w:pPr>
+      <w:r>
+        <w:rPr>
+          <w:rFonts w:ascii="Consolas" w:hAnsi="Consolas"/>
+          <w:sz w:val="18"/>
+        </w:rPr>
+        <w:t>cd people-lead &amp;&amp; python3 generate_planejamento_docs.py</w:t>
+      </w:r>
+    </w:p>
     <w:p>
       <w:r>
         <w:t>Regenerar os completos:</w:t>

</xml_diff>